<commit_message>
Panel Registry: align to authorial intent (testimony, not apologetic)
Per John (2026-06-17): the project is his testimony to his kids/grandkids, not an
apologetic. Add a "what the panels are for" framing to §1 (keep the testimony
true, pastorally safe, and clear — not win arguments). Remove the adversarial /
hostile-premise panel from the Council nomination gaps and note it is
deliberately set aside. Mark the Engine chapter's review as the registry's first
live run (done: punch-list implemented + mirrored). Regenerate the Council docx.

Co-Authored-By: Claude Opus 4.8 <noreply@anthropic.com>
</commit_message>
<xml_diff>
--- a/_implementation-notes/peer-review-panel-registry/IJH_Peer_Review_Panel_Registry_for_Council_2026-06-28_v1.docx
+++ b/_implementation-notes/peer-review-panel-registry/IJH_Peer_Review_Panel_Registry_for_Council_2026-06-28_v1.docx
@@ -130,6 +130,67 @@
       </w:r>
       <w:r>
         <w:t xml:space="preserve">: nothing is ever changed in the manuscript on a panel's say-so. Findings are adjudicated by the author (and, going forward, by this Council).</w:t>
+      </w:r>
+    </w:p>
+    <w:p>
+      <w:pPr>
+        <w:pStyle w:val="ListParagraph"/>
+        <w:numPr>
+          <w:ilvl w:val="0"/>
+          <w:numId w:val="2"/>
+        </w:numPr>
+        <w:spacing w:after="60"/>
+      </w:pPr>
+      <w:r>
+        <w:t xml:space="preserve">*</w:t>
+      </w:r>
+      <w:r>
+        <w:rPr>
+          <w:i/>
+          <w:iCs/>
+        </w:rPr>
+        <w:t xml:space="preserve">What the panels are </w:t>
+      </w:r>
+      <w:r>
+        <w:t xml:space="preserve">for</w:t>
+      </w:r>
+      <w:r>
+        <w:rPr>
+          <w:i/>
+          <w:iCs/>
+        </w:rPr>
+        <w:t xml:space="preserve">.</w:t>
+      </w:r>
+      <w:r>
+        <w:rPr>
+          <w:i/>
+          <w:iCs/>
+        </w:rPr>
+        <w:t xml:space="preserve"> This work is, at heart, the author's </w:t>
+      </w:r>
+      <w:r>
+        <w:rPr>
+          <w:i/>
+          <w:iCs/>
+        </w:rPr>
+        <w:t xml:space="preserve">testimony</w:t>
+      </w:r>
+      <w:r>
+        <w:rPr>
+          <w:i/>
+          <w:iCs/>
+        </w:rPr>
+        <w:t xml:space="preserve"> to his children and grandchildren — what he has discovered of how God works — not an apologetic for skeptics. The panels therefore exist to keep that testimony </w:t>
+      </w:r>
+      <w:r>
+        <w:rPr>
+          <w:i/>
+          <w:iCs/>
+        </w:rPr>
+        <w:t xml:space="preserve">true, pastorally safe, and clear</w:t>
+      </w:r>
+      <w:r>
+        <w:t xml:space="preserve">* for the family it is written to. They are not here to win arguments or to armor the work against opponents.</w:t>
       </w:r>
     </w:p>
     <w:p>
@@ -3736,7 +3797,7 @@
           <w:i/>
           <w:iCs/>
         </w:rPr>
-        <w:t xml:space="preserve">Immediate application:</w:t>
+        <w:t xml:space="preserve">First live run (done):</w:t>
       </w:r>
       <w:r>
         <w:t xml:space="preserve"> the new Vol 3 chapter </w:t>
@@ -3749,7 +3810,7 @@
         <w:t xml:space="preserve">"The Engine Beneath the Force"</w:t>
       </w:r>
       <w:r>
-        <w:t xml:space="preserve"> has not yet been panel-reviewed. Its natural empanelment is the </w:t>
+        <w:t xml:space="preserve"> was reviewed by the </w:t>
       </w:r>
       <w:r>
         <w:rPr>
@@ -3759,7 +3820,18 @@
         <w:t xml:space="preserve">quantitative</w:t>
       </w:r>
       <w:r>
-        <w:t xml:space="preserve"> panel (at minimum Peterson + Polkinghorne), which would, among other things, seat the physics guards in the chapter itself rather than relying on the Vol-1 migration the Vol 3 panel flagged.</w:t>
+        <w:t xml:space="preserve"> panel — the registry's first end-to-end use. The nine-author panel produced nine findings; all were adjudicated, implemented dev-first one at a time, and mirrored to prod, and the review artifact is marked resolved (</w:t>
+      </w:r>
+      <w:r>
+        <w:rPr>
+          <w:rFonts w:ascii="Consolas" w:cs="Consolas" w:eastAsia="Consolas" w:hAnsi="Consolas"/>
+          <w:sz w:val="20"/>
+          <w:szCs w:val="20"/>
+        </w:rPr>
+        <w:t xml:space="preserve">_implementation-notes/peer-review-engine-chapter/</w:t>
+      </w:r>
+      <w:r>
+        <w:t xml:space="preserve">). The empanelment, method, verification, and mirror all worked as designed.</w:t>
       </w:r>
     </w:p>
     <w:p>
@@ -3828,9 +3900,9 @@
         </w:tblBorders>
       </w:tblPr>
       <w:tblGrid>
-        <w:gridCol w:w="3705"/>
-        <w:gridCol w:w="4963"/>
-        <w:gridCol w:w="692"/>
+        <w:gridCol w:w="2609"/>
+        <w:gridCol w:w="6047"/>
+        <w:gridCol w:w="704"/>
       </w:tblGrid>
       <w:tr>
         <w:trPr>
@@ -3838,7 +3910,7 @@
         </w:trPr>
         <w:tc>
           <w:tcPr>
-            <w:tcW w:type="dxa" w:w="3705"/>
+            <w:tcW w:type="dxa" w:w="2609"/>
             <w:tcBorders>
               <w:top w:val="single" w:color="BBBBBB" w:sz="1"/>
               <w:left w:val="single" w:color="BBBBBB" w:sz="1"/>
@@ -3862,7 +3934,7 @@
         </w:tc>
         <w:tc>
           <w:tcPr>
-            <w:tcW w:type="dxa" w:w="4963"/>
+            <w:tcW w:type="dxa" w:w="6047"/>
             <w:tcBorders>
               <w:top w:val="single" w:color="BBBBBB" w:sz="1"/>
               <w:left w:val="single" w:color="BBBBBB" w:sz="1"/>
@@ -3886,7 +3958,7 @@
         </w:tc>
         <w:tc>
           <w:tcPr>
-            <w:tcW w:type="dxa" w:w="692"/>
+            <w:tcW w:type="dxa" w:w="704"/>
             <w:tcBorders>
               <w:top w:val="single" w:color="BBBBBB" w:sz="1"/>
               <w:left w:val="single" w:color="BBBBBB" w:sz="1"/>
@@ -3912,7 +3984,7 @@
       <w:tr>
         <w:tc>
           <w:tcPr>
-            <w:tcW w:type="dxa" w:w="3705"/>
+            <w:tcW w:type="dxa" w:w="2609"/>
             <w:tcBorders>
               <w:top w:val="single" w:color="BBBBBB" w:sz="1"/>
               <w:left w:val="single" w:color="BBBBBB" w:sz="1"/>
@@ -3939,7 +4011,7 @@
         </w:tc>
         <w:tc>
           <w:tcPr>
-            <w:tcW w:type="dxa" w:w="4963"/>
+            <w:tcW w:type="dxa" w:w="6047"/>
             <w:tcBorders>
               <w:top w:val="single" w:color="BBBBBB" w:sz="1"/>
               <w:left w:val="single" w:color="BBBBBB" w:sz="1"/>
@@ -3962,7 +4034,7 @@
         </w:tc>
         <w:tc>
           <w:tcPr>
-            <w:tcW w:type="dxa" w:w="692"/>
+            <w:tcW w:type="dxa" w:w="704"/>
             <w:tcBorders>
               <w:top w:val="single" w:color="BBBBBB" w:sz="1"/>
               <w:left w:val="single" w:color="BBBBBB" w:sz="1"/>
@@ -3987,7 +4059,7 @@
       <w:tr>
         <w:tc>
           <w:tcPr>
-            <w:tcW w:type="dxa" w:w="3705"/>
+            <w:tcW w:type="dxa" w:w="2609"/>
             <w:tcBorders>
               <w:top w:val="single" w:color="BBBBBB" w:sz="1"/>
               <w:left w:val="single" w:color="BBBBBB" w:sz="1"/>
@@ -4014,7 +4086,7 @@
         </w:tc>
         <w:tc>
           <w:tcPr>
-            <w:tcW w:type="dxa" w:w="4963"/>
+            <w:tcW w:type="dxa" w:w="6047"/>
             <w:tcBorders>
               <w:top w:val="single" w:color="BBBBBB" w:sz="1"/>
               <w:left w:val="single" w:color="BBBBBB" w:sz="1"/>
@@ -4037,7 +4109,7 @@
         </w:tc>
         <w:tc>
           <w:tcPr>
-            <w:tcW w:type="dxa" w:w="692"/>
+            <w:tcW w:type="dxa" w:w="704"/>
             <w:tcBorders>
               <w:top w:val="single" w:color="BBBBBB" w:sz="1"/>
               <w:left w:val="single" w:color="BBBBBB" w:sz="1"/>
@@ -4062,7 +4134,7 @@
       <w:tr>
         <w:tc>
           <w:tcPr>
-            <w:tcW w:type="dxa" w:w="3705"/>
+            <w:tcW w:type="dxa" w:w="2609"/>
             <w:tcBorders>
               <w:top w:val="single" w:color="BBBBBB" w:sz="1"/>
               <w:left w:val="single" w:color="BBBBBB" w:sz="1"/>
@@ -4089,7 +4161,7 @@
         </w:tc>
         <w:tc>
           <w:tcPr>
-            <w:tcW w:type="dxa" w:w="4963"/>
+            <w:tcW w:type="dxa" w:w="6047"/>
             <w:tcBorders>
               <w:top w:val="single" w:color="BBBBBB" w:sz="1"/>
               <w:left w:val="single" w:color="BBBBBB" w:sz="1"/>
@@ -4112,7 +4184,7 @@
         </w:tc>
         <w:tc>
           <w:tcPr>
-            <w:tcW w:type="dxa" w:w="692"/>
+            <w:tcW w:type="dxa" w:w="704"/>
             <w:tcBorders>
               <w:top w:val="single" w:color="BBBBBB" w:sz="1"/>
               <w:left w:val="single" w:color="BBBBBB" w:sz="1"/>
@@ -4137,7 +4209,7 @@
       <w:tr>
         <w:tc>
           <w:tcPr>
-            <w:tcW w:type="dxa" w:w="3705"/>
+            <w:tcW w:type="dxa" w:w="2609"/>
             <w:tcBorders>
               <w:top w:val="single" w:color="BBBBBB" w:sz="1"/>
               <w:left w:val="single" w:color="BBBBBB" w:sz="1"/>
@@ -4164,7 +4236,7 @@
         </w:tc>
         <w:tc>
           <w:tcPr>
-            <w:tcW w:type="dxa" w:w="4963"/>
+            <w:tcW w:type="dxa" w:w="6047"/>
             <w:tcBorders>
               <w:top w:val="single" w:color="BBBBBB" w:sz="1"/>
               <w:left w:val="single" w:color="BBBBBB" w:sz="1"/>
@@ -4187,7 +4259,7 @@
         </w:tc>
         <w:tc>
           <w:tcPr>
-            <w:tcW w:type="dxa" w:w="692"/>
+            <w:tcW w:type="dxa" w:w="704"/>
             <w:tcBorders>
               <w:top w:val="single" w:color="BBBBBB" w:sz="1"/>
               <w:left w:val="single" w:color="BBBBBB" w:sz="1"/>
@@ -4212,7 +4284,7 @@
       <w:tr>
         <w:tc>
           <w:tcPr>
-            <w:tcW w:type="dxa" w:w="3705"/>
+            <w:tcW w:type="dxa" w:w="2609"/>
             <w:tcBorders>
               <w:top w:val="single" w:color="BBBBBB" w:sz="1"/>
               <w:left w:val="single" w:color="BBBBBB" w:sz="1"/>
@@ -4239,7 +4311,7 @@
         </w:tc>
         <w:tc>
           <w:tcPr>
-            <w:tcW w:type="dxa" w:w="4963"/>
+            <w:tcW w:type="dxa" w:w="6047"/>
             <w:tcBorders>
               <w:top w:val="single" w:color="BBBBBB" w:sz="1"/>
               <w:left w:val="single" w:color="BBBBBB" w:sz="1"/>
@@ -4272,7 +4344,7 @@
         </w:tc>
         <w:tc>
           <w:tcPr>
-            <w:tcW w:type="dxa" w:w="692"/>
+            <w:tcW w:type="dxa" w:w="704"/>
             <w:tcBorders>
               <w:top w:val="single" w:color="BBBBBB" w:sz="1"/>
               <w:left w:val="single" w:color="BBBBBB" w:sz="1"/>
@@ -4297,7 +4369,7 @@
       <w:tr>
         <w:tc>
           <w:tcPr>
-            <w:tcW w:type="dxa" w:w="3705"/>
+            <w:tcW w:type="dxa" w:w="2609"/>
             <w:tcBorders>
               <w:top w:val="single" w:color="BBBBBB" w:sz="1"/>
               <w:left w:val="single" w:color="BBBBBB" w:sz="1"/>
@@ -4324,7 +4396,7 @@
         </w:tc>
         <w:tc>
           <w:tcPr>
-            <w:tcW w:type="dxa" w:w="4963"/>
+            <w:tcW w:type="dxa" w:w="6047"/>
             <w:tcBorders>
               <w:top w:val="single" w:color="BBBBBB" w:sz="1"/>
               <w:left w:val="single" w:color="BBBBBB" w:sz="1"/>
@@ -4347,85 +4419,7 @@
         </w:tc>
         <w:tc>
           <w:tcPr>
-            <w:tcW w:type="dxa" w:w="692"/>
-            <w:tcBorders>
-              <w:top w:val="single" w:color="BBBBBB" w:sz="1"/>
-              <w:left w:val="single" w:color="BBBBBB" w:sz="1"/>
-              <w:bottom w:val="single" w:color="BBBBBB" w:sz="1"/>
-              <w:right w:val="single" w:color="BBBBBB" w:sz="1"/>
-            </w:tcBorders>
-            <w:tcMar>
-              <w:top w:type="dxa" w:w="60"/>
-              <w:left w:type="dxa" w:w="100"/>
-              <w:bottom w:type="dxa" w:w="60"/>
-              <w:right w:type="dxa" w:w="100"/>
-            </w:tcMar>
-            <w:vAlign w:val="center"/>
-          </w:tcPr>
-          <w:p>
-            <w:r>
-              <w:t xml:space="preserve"/>
-            </w:r>
-          </w:p>
-        </w:tc>
-      </w:tr>
-      <w:tr>
-        <w:tc>
-          <w:tcPr>
-            <w:tcW w:type="dxa" w:w="3705"/>
-            <w:tcBorders>
-              <w:top w:val="single" w:color="BBBBBB" w:sz="1"/>
-              <w:left w:val="single" w:color="BBBBBB" w:sz="1"/>
-              <w:bottom w:val="single" w:color="BBBBBB" w:sz="1"/>
-              <w:right w:val="single" w:color="BBBBBB" w:sz="1"/>
-            </w:tcBorders>
-            <w:tcMar>
-              <w:top w:type="dxa" w:w="60"/>
-              <w:left w:type="dxa" w:w="100"/>
-              <w:bottom w:type="dxa" w:w="60"/>
-              <w:right w:type="dxa" w:w="100"/>
-            </w:tcMar>
-            <w:vAlign w:val="center"/>
-          </w:tcPr>
-          <w:p>
-            <w:r>
-              <w:rPr>
-                <w:b/>
-                <w:bCs/>
-              </w:rPr>
-              <w:t xml:space="preserve">An openly adversarial panel</w:t>
-            </w:r>
-            <w:r>
-              <w:t xml:space="preserve"> (a cessationist; a skeptic of "spiritual laws"; a category-error philosopher)</w:t>
-            </w:r>
-          </w:p>
-        </w:tc>
-        <w:tc>
-          <w:tcPr>
-            <w:tcW w:type="dxa" w:w="4963"/>
-            <w:tcBorders>
-              <w:top w:val="single" w:color="BBBBBB" w:sz="1"/>
-              <w:left w:val="single" w:color="BBBBBB" w:sz="1"/>
-              <w:bottom w:val="single" w:color="BBBBBB" w:sz="1"/>
-              <w:right w:val="single" w:color="BBBBBB" w:sz="1"/>
-            </w:tcBorders>
-            <w:tcMar>
-              <w:top w:type="dxa" w:w="60"/>
-              <w:left w:type="dxa" w:w="100"/>
-              <w:bottom w:type="dxa" w:w="60"/>
-              <w:right w:type="dxa" w:w="100"/>
-            </w:tcMar>
-            <w:vAlign w:val="center"/>
-          </w:tcPr>
-          <w:p>
-            <w:r>
-              <w:t xml:space="preserve">Every panel so far has been broadly sympathetic; one hostile-to-the-premises panel would test the foundations, not the finish</w:t>
-            </w:r>
-          </w:p>
-        </w:tc>
-        <w:tc>
-          <w:tcPr>
-            <w:tcW w:type="dxa" w:w="692"/>
+            <w:tcW w:type="dxa" w:w="704"/>
             <w:tcBorders>
               <w:top w:val="single" w:color="BBBBBB" w:sz="1"/>
               <w:left w:val="single" w:color="BBBBBB" w:sz="1"/>
@@ -4454,6 +4448,46 @@
       </w:pPr>
       <w:r>
         <w:t xml:space="preserve"/>
+      </w:r>
+    </w:p>
+    <w:p>
+      <w:pPr>
+        <w:spacing w:after="140"/>
+      </w:pPr>
+      <w:r>
+        <w:rPr>
+          <w:i/>
+          <w:iCs/>
+        </w:rPr>
+        <w:t xml:space="preserve">One kind of panel has been deliberately </w:t>
+      </w:r>
+      <w:r>
+        <w:rPr>
+          <w:i/>
+          <w:iCs/>
+        </w:rPr>
+        <w:t xml:space="preserve">set aside</w:t>
+      </w:r>
+      <w:r>
+        <w:rPr>
+          <w:i/>
+          <w:iCs/>
+        </w:rPr>
+        <w:t xml:space="preserve"> — not offered for the Council to fill: an openly adversarial / apologetic panel. This work is the author's </w:t>
+      </w:r>
+      <w:r>
+        <w:rPr>
+          <w:i/>
+          <w:iCs/>
+        </w:rPr>
+        <w:t xml:space="preserve">testimony</w:t>
+      </w:r>
+      <w:r>
+        <w:rPr>
+          <w:i/>
+          <w:iCs/>
+        </w:rPr>
+        <w:t xml:space="preserve"> to his family, not a defense for skeptics; the panels keep it true, pastorally safe, and clear, and do not exist to stress the foundations against an opponent.</w:t>
       </w:r>
     </w:p>
     <w:p>

</xml_diff>